<commit_message>
feat: initialize OBE curriculum documentation, analysis matrices, assessment rubrics, and supporting conversion scripts for SISTEKIN 2026.
</commit_message>
<xml_diff>
--- a/KURIKULUM2026_REVISI/003_STANDAR_14_CPL_DAN_PEMETAAN_BoK_APTIKOM.docx
+++ b/KURIKULUM2026_REVISI/003_STANDAR_14_CPL_DAN_PEMETAAN_BoK_APTIKOM.docx
@@ -267,9 +267,9 @@
               <w:br/>
               <w:t xml:space="preserve">        SNDIKTI["SN-Dikti Permendikbudristek 53/2023"]</w:t>
               <w:br/>
-              <w:t xml:space="preserve">        IS2020["APTIKOM IS2020 (19 Bahan Kajian)"]</w:t>
+              <w:t xml:space="preserve">        IS2020["APTIKOM IS2020 (21 Bahan Kajian)"]</w:t>
               <w:br/>
-              <w:t xml:space="preserve">        IT2017["APTIKOM IT2017 (14/27 Bahan Kajian)"]</w:t>
+              <w:t xml:space="preserve">        IT2017["APTIKOM IT2017 (15 BK, dirumuskan dari 27 BK)"]</w:t>
               <w:br/>
               <w:t xml:space="preserve">    end</w:t>
               <w:br/>
@@ -6283,7 +6283,7 @@
           <w:color w:val="1F3864"/>
           <w:sz w:val="26"/>
         </w:rPr>
-        <w:t>4. MATRIKS SILANG CPL ↔ 19 BAHAN KAJIAN (BoK) IS2020 (APTIKOM v2.0)</w:t>
+        <w:t>4. MATRIKS SILANG CPL ↔ 21 BAHAN KAJIAN (BoK) IS2020 (APTIKOM v2.0)</w:t>
       </w:r>
     </w:p>
     <w:p>
@@ -6296,7 +6296,24 @@
           <w:color w:val="262626"/>
           <w:sz w:val="21"/>
         </w:rPr>
-        <w:t>Berikut adalah matriks cross-tabulation pemenuhan 19 Bahan Kajian Standar APTIKOM S1 Sistem Informasi (IS2020) terhadap 14 CPL SISTEKIN:</w:t>
+        <w:t xml:space="preserve">Berikut adalah matriks cross-tabulation pemenuhan 21 Bahan Kajian Standar APTIKOM S1 Sistem Informasi (IS2020) terhadap 14 CPL SISTEKIN. Dari 21 Bahan Kajian ini, </w:t>
+      </w:r>
+      <w:r>
+        <w:rPr>
+          <w:rFonts w:ascii="Calibri" w:hAnsi="Calibri"/>
+          <w:b/>
+          <w:color w:val="262626"/>
+          <w:sz w:val="21"/>
+        </w:rPr>
+        <w:t>11 di antaranya merupakan BK kompetensi utama yang wajib diadopsi</w:t>
+      </w:r>
+      <w:r>
+        <w:rPr>
+          <w:rFonts w:ascii="Calibri" w:hAnsi="Calibri"/>
+          <w:color w:val="262626"/>
+          <w:sz w:val="21"/>
+        </w:rPr>
+        <w:t xml:space="preserve"> menurut INSTRUKSI Panduan OBE APTIKOM SI v2.0, dan 10 sisanya merupakan BK pendukung serta BK penciri khas Prodi SISTEKIN:</w:t>
       </w:r>
     </w:p>
     <w:tbl>
@@ -13376,10 +13393,877 @@
           </w:p>
         </w:tc>
       </w:tr>
+      <w:tr>
+        <w:trPr>
+          <w:cantSplit/>
+        </w:trPr>
+        <w:tc>
+          <w:tcPr>
+            <w:tcW w:type="dxa" w:w="564"/>
+            <w:vAlign w:val="center"/>
+            <w:shd w:fill="F2F5F9"/>
+            <w:tcMar>
+              <w:top w:w="80" w:type="dxa"/>
+              <w:bottom w:w="80" w:type="dxa"/>
+              <w:left w:w="100" w:type="dxa"/>
+              <w:right w:w="100" w:type="dxa"/>
+            </w:tcMar>
+          </w:tcPr>
+          <w:p>
+            <w:pPr>
+              <w:spacing w:before="20" w:after="20" w:line="252" w:lineRule="auto"/>
+              <w:jc w:val="left"/>
+            </w:pPr>
+            <w:r>
+              <w:rPr>
+                <w:rFonts w:ascii="Calibri" w:hAnsi="Calibri"/>
+                <w:b/>
+                <w:color w:val="262626"/>
+                <w:sz w:val="19"/>
+              </w:rPr>
+              <w:t>BK-IS20</w:t>
+            </w:r>
+          </w:p>
+        </w:tc>
+        <w:tc>
+          <w:tcPr>
+            <w:tcW w:type="dxa" w:w="564"/>
+            <w:vAlign w:val="center"/>
+            <w:shd w:fill="F2F5F9"/>
+            <w:tcMar>
+              <w:top w:w="80" w:type="dxa"/>
+              <w:bottom w:w="80" w:type="dxa"/>
+              <w:left w:w="100" w:type="dxa"/>
+              <w:right w:w="100" w:type="dxa"/>
+            </w:tcMar>
+          </w:tcPr>
+          <w:p>
+            <w:pPr>
+              <w:spacing w:before="20" w:after="20" w:line="252" w:lineRule="auto"/>
+              <w:jc w:val="left"/>
+            </w:pPr>
+            <w:r>
+              <w:rPr>
+                <w:rFonts w:ascii="Calibri" w:hAnsi="Calibri"/>
+                <w:i/>
+                <w:color w:val="262626"/>
+                <w:sz w:val="19"/>
+              </w:rPr>
+              <w:t>Ethics, Use and Implications for Society</w:t>
+            </w:r>
+          </w:p>
+        </w:tc>
+        <w:tc>
+          <w:tcPr>
+            <w:tcW w:type="dxa" w:w="564"/>
+            <w:vAlign w:val="center"/>
+            <w:shd w:fill="F2F5F9"/>
+            <w:tcMar>
+              <w:top w:w="80" w:type="dxa"/>
+              <w:bottom w:w="80" w:type="dxa"/>
+              <w:left w:w="100" w:type="dxa"/>
+              <w:right w:w="100" w:type="dxa"/>
+            </w:tcMar>
+          </w:tcPr>
+          <w:p>
+            <w:pPr>
+              <w:spacing w:before="20" w:after="20" w:line="252" w:lineRule="auto"/>
+              <w:jc w:val="left"/>
+            </w:pPr>
+            <w:r>
+              <w:rPr>
+                <w:rFonts w:ascii="Calibri" w:hAnsi="Calibri"/>
+                <w:color w:val="262626"/>
+                <w:sz w:val="19"/>
+              </w:rPr>
+              <w:t>✅</w:t>
+            </w:r>
+          </w:p>
+        </w:tc>
+        <w:tc>
+          <w:tcPr>
+            <w:tcW w:type="dxa" w:w="564"/>
+            <w:vAlign w:val="center"/>
+            <w:shd w:fill="F2F5F9"/>
+            <w:tcMar>
+              <w:top w:w="80" w:type="dxa"/>
+              <w:bottom w:w="80" w:type="dxa"/>
+              <w:left w:w="100" w:type="dxa"/>
+              <w:right w:w="100" w:type="dxa"/>
+            </w:tcMar>
+          </w:tcPr>
+          <w:p>
+            <w:pPr>
+              <w:spacing w:before="20" w:after="20" w:line="252" w:lineRule="auto"/>
+              <w:jc w:val="left"/>
+            </w:pPr>
+          </w:p>
+        </w:tc>
+        <w:tc>
+          <w:tcPr>
+            <w:tcW w:type="dxa" w:w="564"/>
+            <w:vAlign w:val="center"/>
+            <w:shd w:fill="F2F5F9"/>
+            <w:tcMar>
+              <w:top w:w="80" w:type="dxa"/>
+              <w:bottom w:w="80" w:type="dxa"/>
+              <w:left w:w="100" w:type="dxa"/>
+              <w:right w:w="100" w:type="dxa"/>
+            </w:tcMar>
+          </w:tcPr>
+          <w:p>
+            <w:pPr>
+              <w:spacing w:before="20" w:after="20" w:line="252" w:lineRule="auto"/>
+              <w:jc w:val="left"/>
+            </w:pPr>
+          </w:p>
+        </w:tc>
+        <w:tc>
+          <w:tcPr>
+            <w:tcW w:type="dxa" w:w="564"/>
+            <w:vAlign w:val="center"/>
+            <w:shd w:fill="F2F5F9"/>
+            <w:tcMar>
+              <w:top w:w="80" w:type="dxa"/>
+              <w:bottom w:w="80" w:type="dxa"/>
+              <w:left w:w="100" w:type="dxa"/>
+              <w:right w:w="100" w:type="dxa"/>
+            </w:tcMar>
+          </w:tcPr>
+          <w:p>
+            <w:pPr>
+              <w:spacing w:before="20" w:after="20" w:line="252" w:lineRule="auto"/>
+              <w:jc w:val="left"/>
+            </w:pPr>
+            <w:r>
+              <w:rPr>
+                <w:rFonts w:ascii="Calibri" w:hAnsi="Calibri"/>
+                <w:color w:val="262626"/>
+                <w:sz w:val="19"/>
+              </w:rPr>
+              <w:t>✅</w:t>
+            </w:r>
+          </w:p>
+        </w:tc>
+        <w:tc>
+          <w:tcPr>
+            <w:tcW w:type="dxa" w:w="564"/>
+            <w:vAlign w:val="center"/>
+            <w:shd w:fill="F2F5F9"/>
+            <w:tcMar>
+              <w:top w:w="80" w:type="dxa"/>
+              <w:bottom w:w="80" w:type="dxa"/>
+              <w:left w:w="100" w:type="dxa"/>
+              <w:right w:w="100" w:type="dxa"/>
+            </w:tcMar>
+          </w:tcPr>
+          <w:p>
+            <w:pPr>
+              <w:spacing w:before="20" w:after="20" w:line="252" w:lineRule="auto"/>
+              <w:jc w:val="left"/>
+            </w:pPr>
+          </w:p>
+        </w:tc>
+        <w:tc>
+          <w:tcPr>
+            <w:tcW w:type="dxa" w:w="564"/>
+            <w:vAlign w:val="center"/>
+            <w:shd w:fill="F2F5F9"/>
+            <w:tcMar>
+              <w:top w:w="80" w:type="dxa"/>
+              <w:bottom w:w="80" w:type="dxa"/>
+              <w:left w:w="100" w:type="dxa"/>
+              <w:right w:w="100" w:type="dxa"/>
+            </w:tcMar>
+          </w:tcPr>
+          <w:p>
+            <w:pPr>
+              <w:spacing w:before="20" w:after="20" w:line="252" w:lineRule="auto"/>
+              <w:jc w:val="left"/>
+            </w:pPr>
+          </w:p>
+        </w:tc>
+        <w:tc>
+          <w:tcPr>
+            <w:tcW w:type="dxa" w:w="564"/>
+            <w:vAlign w:val="center"/>
+            <w:shd w:fill="F2F5F9"/>
+            <w:tcMar>
+              <w:top w:w="80" w:type="dxa"/>
+              <w:bottom w:w="80" w:type="dxa"/>
+              <w:left w:w="100" w:type="dxa"/>
+              <w:right w:w="100" w:type="dxa"/>
+            </w:tcMar>
+          </w:tcPr>
+          <w:p>
+            <w:pPr>
+              <w:spacing w:before="20" w:after="20" w:line="252" w:lineRule="auto"/>
+              <w:jc w:val="left"/>
+            </w:pPr>
+            <w:r>
+              <w:rPr>
+                <w:rFonts w:ascii="Calibri" w:hAnsi="Calibri"/>
+                <w:color w:val="262626"/>
+                <w:sz w:val="19"/>
+              </w:rPr>
+              <w:t>✅</w:t>
+            </w:r>
+          </w:p>
+        </w:tc>
+        <w:tc>
+          <w:tcPr>
+            <w:tcW w:type="dxa" w:w="564"/>
+            <w:vAlign w:val="center"/>
+            <w:shd w:fill="F2F5F9"/>
+            <w:tcMar>
+              <w:top w:w="80" w:type="dxa"/>
+              <w:bottom w:w="80" w:type="dxa"/>
+              <w:left w:w="100" w:type="dxa"/>
+              <w:right w:w="100" w:type="dxa"/>
+            </w:tcMar>
+          </w:tcPr>
+          <w:p>
+            <w:pPr>
+              <w:spacing w:before="20" w:after="20" w:line="252" w:lineRule="auto"/>
+              <w:jc w:val="left"/>
+            </w:pPr>
+          </w:p>
+        </w:tc>
+        <w:tc>
+          <w:tcPr>
+            <w:tcW w:type="dxa" w:w="564"/>
+            <w:vAlign w:val="center"/>
+            <w:shd w:fill="F2F5F9"/>
+            <w:tcMar>
+              <w:top w:w="80" w:type="dxa"/>
+              <w:bottom w:w="80" w:type="dxa"/>
+              <w:left w:w="100" w:type="dxa"/>
+              <w:right w:w="100" w:type="dxa"/>
+            </w:tcMar>
+          </w:tcPr>
+          <w:p>
+            <w:pPr>
+              <w:spacing w:before="20" w:after="20" w:line="252" w:lineRule="auto"/>
+              <w:jc w:val="left"/>
+            </w:pPr>
+          </w:p>
+        </w:tc>
+        <w:tc>
+          <w:tcPr>
+            <w:tcW w:type="dxa" w:w="564"/>
+            <w:vAlign w:val="center"/>
+            <w:shd w:fill="F2F5F9"/>
+            <w:tcMar>
+              <w:top w:w="80" w:type="dxa"/>
+              <w:bottom w:w="80" w:type="dxa"/>
+              <w:left w:w="100" w:type="dxa"/>
+              <w:right w:w="100" w:type="dxa"/>
+            </w:tcMar>
+          </w:tcPr>
+          <w:p>
+            <w:pPr>
+              <w:spacing w:before="20" w:after="20" w:line="252" w:lineRule="auto"/>
+              <w:jc w:val="left"/>
+            </w:pPr>
+          </w:p>
+        </w:tc>
+        <w:tc>
+          <w:tcPr>
+            <w:tcW w:type="dxa" w:w="564"/>
+            <w:vAlign w:val="center"/>
+            <w:shd w:fill="F2F5F9"/>
+            <w:tcMar>
+              <w:top w:w="80" w:type="dxa"/>
+              <w:bottom w:w="80" w:type="dxa"/>
+              <w:left w:w="100" w:type="dxa"/>
+              <w:right w:w="100" w:type="dxa"/>
+            </w:tcMar>
+          </w:tcPr>
+          <w:p>
+            <w:pPr>
+              <w:spacing w:before="20" w:after="20" w:line="252" w:lineRule="auto"/>
+              <w:jc w:val="left"/>
+            </w:pPr>
+          </w:p>
+        </w:tc>
+        <w:tc>
+          <w:tcPr>
+            <w:tcW w:type="dxa" w:w="564"/>
+            <w:vAlign w:val="center"/>
+            <w:shd w:fill="F2F5F9"/>
+            <w:tcMar>
+              <w:top w:w="80" w:type="dxa"/>
+              <w:bottom w:w="80" w:type="dxa"/>
+              <w:left w:w="100" w:type="dxa"/>
+              <w:right w:w="100" w:type="dxa"/>
+            </w:tcMar>
+          </w:tcPr>
+          <w:p>
+            <w:pPr>
+              <w:spacing w:before="20" w:after="20" w:line="252" w:lineRule="auto"/>
+              <w:jc w:val="left"/>
+            </w:pPr>
+            <w:r>
+              <w:rPr>
+                <w:rFonts w:ascii="Calibri" w:hAnsi="Calibri"/>
+                <w:color w:val="262626"/>
+                <w:sz w:val="19"/>
+              </w:rPr>
+              <w:t>✅</w:t>
+            </w:r>
+          </w:p>
+        </w:tc>
+        <w:tc>
+          <w:tcPr>
+            <w:tcW w:type="dxa" w:w="564"/>
+            <w:vAlign w:val="center"/>
+            <w:shd w:fill="F2F5F9"/>
+            <w:tcMar>
+              <w:top w:w="80" w:type="dxa"/>
+              <w:bottom w:w="80" w:type="dxa"/>
+              <w:left w:w="100" w:type="dxa"/>
+              <w:right w:w="100" w:type="dxa"/>
+            </w:tcMar>
+          </w:tcPr>
+          <w:p>
+            <w:pPr>
+              <w:spacing w:before="20" w:after="20" w:line="252" w:lineRule="auto"/>
+              <w:jc w:val="left"/>
+            </w:pPr>
+          </w:p>
+        </w:tc>
+        <w:tc>
+          <w:tcPr>
+            <w:tcW w:type="dxa" w:w="564"/>
+            <w:vAlign w:val="center"/>
+            <w:shd w:fill="F2F5F9"/>
+            <w:tcMar>
+              <w:top w:w="80" w:type="dxa"/>
+              <w:bottom w:w="80" w:type="dxa"/>
+              <w:left w:w="100" w:type="dxa"/>
+              <w:right w:w="100" w:type="dxa"/>
+            </w:tcMar>
+          </w:tcPr>
+          <w:p>
+            <w:pPr>
+              <w:spacing w:before="20" w:after="20" w:line="252" w:lineRule="auto"/>
+              <w:jc w:val="left"/>
+            </w:pPr>
+          </w:p>
+        </w:tc>
+      </w:tr>
+      <w:tr>
+        <w:trPr>
+          <w:cantSplit/>
+        </w:trPr>
+        <w:tc>
+          <w:tcPr>
+            <w:tcW w:type="dxa" w:w="564"/>
+            <w:vAlign w:val="center"/>
+            <w:shd w:fill="FFFFFF"/>
+            <w:tcMar>
+              <w:top w:w="80" w:type="dxa"/>
+              <w:bottom w:w="80" w:type="dxa"/>
+              <w:left w:w="100" w:type="dxa"/>
+              <w:right w:w="100" w:type="dxa"/>
+            </w:tcMar>
+          </w:tcPr>
+          <w:p>
+            <w:pPr>
+              <w:spacing w:before="20" w:after="20" w:line="252" w:lineRule="auto"/>
+              <w:jc w:val="left"/>
+            </w:pPr>
+            <w:r>
+              <w:rPr>
+                <w:rFonts w:ascii="Calibri" w:hAnsi="Calibri"/>
+                <w:b/>
+                <w:color w:val="262626"/>
+                <w:sz w:val="19"/>
+              </w:rPr>
+              <w:t>BK-IS21</w:t>
+            </w:r>
+          </w:p>
+        </w:tc>
+        <w:tc>
+          <w:tcPr>
+            <w:tcW w:type="dxa" w:w="564"/>
+            <w:vAlign w:val="center"/>
+            <w:shd w:fill="FFFFFF"/>
+            <w:tcMar>
+              <w:top w:w="80" w:type="dxa"/>
+              <w:bottom w:w="80" w:type="dxa"/>
+              <w:left w:w="100" w:type="dxa"/>
+              <w:right w:w="100" w:type="dxa"/>
+            </w:tcMar>
+          </w:tcPr>
+          <w:p>
+            <w:pPr>
+              <w:spacing w:before="20" w:after="20" w:line="252" w:lineRule="auto"/>
+              <w:jc w:val="left"/>
+            </w:pPr>
+            <w:r>
+              <w:rPr>
+                <w:rFonts w:ascii="Calibri" w:hAnsi="Calibri"/>
+                <w:i/>
+                <w:color w:val="262626"/>
+                <w:sz w:val="19"/>
+              </w:rPr>
+              <w:t>Internship and Professional Practice</w:t>
+            </w:r>
+          </w:p>
+        </w:tc>
+        <w:tc>
+          <w:tcPr>
+            <w:tcW w:type="dxa" w:w="564"/>
+            <w:vAlign w:val="center"/>
+            <w:shd w:fill="FFFFFF"/>
+            <w:tcMar>
+              <w:top w:w="80" w:type="dxa"/>
+              <w:bottom w:w="80" w:type="dxa"/>
+              <w:left w:w="100" w:type="dxa"/>
+              <w:right w:w="100" w:type="dxa"/>
+            </w:tcMar>
+          </w:tcPr>
+          <w:p>
+            <w:pPr>
+              <w:spacing w:before="20" w:after="20" w:line="252" w:lineRule="auto"/>
+              <w:jc w:val="left"/>
+            </w:pPr>
+            <w:r>
+              <w:rPr>
+                <w:rFonts w:ascii="Calibri" w:hAnsi="Calibri"/>
+                <w:color w:val="262626"/>
+                <w:sz w:val="19"/>
+              </w:rPr>
+              <w:t>✅</w:t>
+            </w:r>
+          </w:p>
+        </w:tc>
+        <w:tc>
+          <w:tcPr>
+            <w:tcW w:type="dxa" w:w="564"/>
+            <w:vAlign w:val="center"/>
+            <w:shd w:fill="FFFFFF"/>
+            <w:tcMar>
+              <w:top w:w="80" w:type="dxa"/>
+              <w:bottom w:w="80" w:type="dxa"/>
+              <w:left w:w="100" w:type="dxa"/>
+              <w:right w:w="100" w:type="dxa"/>
+            </w:tcMar>
+          </w:tcPr>
+          <w:p>
+            <w:pPr>
+              <w:spacing w:before="20" w:after="20" w:line="252" w:lineRule="auto"/>
+              <w:jc w:val="left"/>
+            </w:pPr>
+            <w:r>
+              <w:rPr>
+                <w:rFonts w:ascii="Calibri" w:hAnsi="Calibri"/>
+                <w:color w:val="262626"/>
+                <w:sz w:val="19"/>
+              </w:rPr>
+              <w:t>✅</w:t>
+            </w:r>
+          </w:p>
+        </w:tc>
+        <w:tc>
+          <w:tcPr>
+            <w:tcW w:type="dxa" w:w="564"/>
+            <w:vAlign w:val="center"/>
+            <w:shd w:fill="FFFFFF"/>
+            <w:tcMar>
+              <w:top w:w="80" w:type="dxa"/>
+              <w:bottom w:w="80" w:type="dxa"/>
+              <w:left w:w="100" w:type="dxa"/>
+              <w:right w:w="100" w:type="dxa"/>
+            </w:tcMar>
+          </w:tcPr>
+          <w:p>
+            <w:pPr>
+              <w:spacing w:before="20" w:after="20" w:line="252" w:lineRule="auto"/>
+              <w:jc w:val="left"/>
+            </w:pPr>
+            <w:r>
+              <w:rPr>
+                <w:rFonts w:ascii="Calibri" w:hAnsi="Calibri"/>
+                <w:color w:val="262626"/>
+                <w:sz w:val="19"/>
+              </w:rPr>
+              <w:t>✅</w:t>
+            </w:r>
+          </w:p>
+        </w:tc>
+        <w:tc>
+          <w:tcPr>
+            <w:tcW w:type="dxa" w:w="564"/>
+            <w:vAlign w:val="center"/>
+            <w:shd w:fill="FFFFFF"/>
+            <w:tcMar>
+              <w:top w:w="80" w:type="dxa"/>
+              <w:bottom w:w="80" w:type="dxa"/>
+              <w:left w:w="100" w:type="dxa"/>
+              <w:right w:w="100" w:type="dxa"/>
+            </w:tcMar>
+          </w:tcPr>
+          <w:p>
+            <w:pPr>
+              <w:spacing w:before="20" w:after="20" w:line="252" w:lineRule="auto"/>
+              <w:jc w:val="left"/>
+            </w:pPr>
+            <w:r>
+              <w:rPr>
+                <w:rFonts w:ascii="Calibri" w:hAnsi="Calibri"/>
+                <w:color w:val="262626"/>
+                <w:sz w:val="19"/>
+              </w:rPr>
+              <w:t>✅</w:t>
+            </w:r>
+          </w:p>
+        </w:tc>
+        <w:tc>
+          <w:tcPr>
+            <w:tcW w:type="dxa" w:w="564"/>
+            <w:vAlign w:val="center"/>
+            <w:shd w:fill="FFFFFF"/>
+            <w:tcMar>
+              <w:top w:w="80" w:type="dxa"/>
+              <w:bottom w:w="80" w:type="dxa"/>
+              <w:left w:w="100" w:type="dxa"/>
+              <w:right w:w="100" w:type="dxa"/>
+            </w:tcMar>
+          </w:tcPr>
+          <w:p>
+            <w:pPr>
+              <w:spacing w:before="20" w:after="20" w:line="252" w:lineRule="auto"/>
+              <w:jc w:val="left"/>
+            </w:pPr>
+          </w:p>
+        </w:tc>
+        <w:tc>
+          <w:tcPr>
+            <w:tcW w:type="dxa" w:w="564"/>
+            <w:vAlign w:val="center"/>
+            <w:shd w:fill="FFFFFF"/>
+            <w:tcMar>
+              <w:top w:w="80" w:type="dxa"/>
+              <w:bottom w:w="80" w:type="dxa"/>
+              <w:left w:w="100" w:type="dxa"/>
+              <w:right w:w="100" w:type="dxa"/>
+            </w:tcMar>
+          </w:tcPr>
+          <w:p>
+            <w:pPr>
+              <w:spacing w:before="20" w:after="20" w:line="252" w:lineRule="auto"/>
+              <w:jc w:val="left"/>
+            </w:pPr>
+          </w:p>
+        </w:tc>
+        <w:tc>
+          <w:tcPr>
+            <w:tcW w:type="dxa" w:w="564"/>
+            <w:vAlign w:val="center"/>
+            <w:shd w:fill="FFFFFF"/>
+            <w:tcMar>
+              <w:top w:w="80" w:type="dxa"/>
+              <w:bottom w:w="80" w:type="dxa"/>
+              <w:left w:w="100" w:type="dxa"/>
+              <w:right w:w="100" w:type="dxa"/>
+            </w:tcMar>
+          </w:tcPr>
+          <w:p>
+            <w:pPr>
+              <w:spacing w:before="20" w:after="20" w:line="252" w:lineRule="auto"/>
+              <w:jc w:val="left"/>
+            </w:pPr>
+          </w:p>
+        </w:tc>
+        <w:tc>
+          <w:tcPr>
+            <w:tcW w:type="dxa" w:w="564"/>
+            <w:vAlign w:val="center"/>
+            <w:shd w:fill="FFFFFF"/>
+            <w:tcMar>
+              <w:top w:w="80" w:type="dxa"/>
+              <w:bottom w:w="80" w:type="dxa"/>
+              <w:left w:w="100" w:type="dxa"/>
+              <w:right w:w="100" w:type="dxa"/>
+            </w:tcMar>
+          </w:tcPr>
+          <w:p>
+            <w:pPr>
+              <w:spacing w:before="20" w:after="20" w:line="252" w:lineRule="auto"/>
+              <w:jc w:val="left"/>
+            </w:pPr>
+          </w:p>
+        </w:tc>
+        <w:tc>
+          <w:tcPr>
+            <w:tcW w:type="dxa" w:w="564"/>
+            <w:vAlign w:val="center"/>
+            <w:shd w:fill="FFFFFF"/>
+            <w:tcMar>
+              <w:top w:w="80" w:type="dxa"/>
+              <w:bottom w:w="80" w:type="dxa"/>
+              <w:left w:w="100" w:type="dxa"/>
+              <w:right w:w="100" w:type="dxa"/>
+            </w:tcMar>
+          </w:tcPr>
+          <w:p>
+            <w:pPr>
+              <w:spacing w:before="20" w:after="20" w:line="252" w:lineRule="auto"/>
+              <w:jc w:val="left"/>
+            </w:pPr>
+          </w:p>
+        </w:tc>
+        <w:tc>
+          <w:tcPr>
+            <w:tcW w:type="dxa" w:w="564"/>
+            <w:vAlign w:val="center"/>
+            <w:shd w:fill="FFFFFF"/>
+            <w:tcMar>
+              <w:top w:w="80" w:type="dxa"/>
+              <w:bottom w:w="80" w:type="dxa"/>
+              <w:left w:w="100" w:type="dxa"/>
+              <w:right w:w="100" w:type="dxa"/>
+            </w:tcMar>
+          </w:tcPr>
+          <w:p>
+            <w:pPr>
+              <w:spacing w:before="20" w:after="20" w:line="252" w:lineRule="auto"/>
+              <w:jc w:val="left"/>
+            </w:pPr>
+          </w:p>
+        </w:tc>
+        <w:tc>
+          <w:tcPr>
+            <w:tcW w:type="dxa" w:w="564"/>
+            <w:vAlign w:val="center"/>
+            <w:shd w:fill="FFFFFF"/>
+            <w:tcMar>
+              <w:top w:w="80" w:type="dxa"/>
+              <w:bottom w:w="80" w:type="dxa"/>
+              <w:left w:w="100" w:type="dxa"/>
+              <w:right w:w="100" w:type="dxa"/>
+            </w:tcMar>
+          </w:tcPr>
+          <w:p>
+            <w:pPr>
+              <w:spacing w:before="20" w:after="20" w:line="252" w:lineRule="auto"/>
+              <w:jc w:val="left"/>
+            </w:pPr>
+          </w:p>
+        </w:tc>
+        <w:tc>
+          <w:tcPr>
+            <w:tcW w:type="dxa" w:w="564"/>
+            <w:vAlign w:val="center"/>
+            <w:shd w:fill="FFFFFF"/>
+            <w:tcMar>
+              <w:top w:w="80" w:type="dxa"/>
+              <w:bottom w:w="80" w:type="dxa"/>
+              <w:left w:w="100" w:type="dxa"/>
+              <w:right w:w="100" w:type="dxa"/>
+            </w:tcMar>
+          </w:tcPr>
+          <w:p>
+            <w:pPr>
+              <w:spacing w:before="20" w:after="20" w:line="252" w:lineRule="auto"/>
+              <w:jc w:val="left"/>
+            </w:pPr>
+          </w:p>
+        </w:tc>
+        <w:tc>
+          <w:tcPr>
+            <w:tcW w:type="dxa" w:w="564"/>
+            <w:vAlign w:val="center"/>
+            <w:shd w:fill="FFFFFF"/>
+            <w:tcMar>
+              <w:top w:w="80" w:type="dxa"/>
+              <w:bottom w:w="80" w:type="dxa"/>
+              <w:left w:w="100" w:type="dxa"/>
+              <w:right w:w="100" w:type="dxa"/>
+            </w:tcMar>
+          </w:tcPr>
+          <w:p>
+            <w:pPr>
+              <w:spacing w:before="20" w:after="20" w:line="252" w:lineRule="auto"/>
+              <w:jc w:val="left"/>
+            </w:pPr>
+          </w:p>
+        </w:tc>
+        <w:tc>
+          <w:tcPr>
+            <w:tcW w:type="dxa" w:w="564"/>
+            <w:vAlign w:val="center"/>
+            <w:shd w:fill="FFFFFF"/>
+            <w:tcMar>
+              <w:top w:w="80" w:type="dxa"/>
+              <w:bottom w:w="80" w:type="dxa"/>
+              <w:left w:w="100" w:type="dxa"/>
+              <w:right w:w="100" w:type="dxa"/>
+            </w:tcMar>
+          </w:tcPr>
+          <w:p>
+            <w:pPr>
+              <w:spacing w:before="20" w:after="20" w:line="252" w:lineRule="auto"/>
+              <w:jc w:val="left"/>
+            </w:pPr>
+          </w:p>
+        </w:tc>
+      </w:tr>
     </w:tbl>
     <w:p>
       <w:pPr>
         <w:spacing w:after="120"/>
+      </w:pPr>
+    </w:p>
+    <w:tbl>
+      <w:tblPr>
+        <w:tblW w:type="auto" w:w="0"/>
+        <w:jc w:val="center"/>
+        <w:tblLayout w:type="fixed"/>
+        <w:tblLook w:firstColumn="1" w:firstRow="1" w:lastColumn="0" w:lastRow="0" w:noHBand="0" w:noVBand="1" w:val="04A0"/>
+      </w:tblPr>
+      <w:tblGrid>
+        <w:gridCol w:w="9029"/>
+      </w:tblGrid>
+      <w:tr>
+        <w:tc>
+          <w:tcPr>
+            <w:tcW w:type="dxa" w:w="9360"/>
+            <w:shd w:fill="EEF4FB"/>
+            <w:tcMar>
+              <w:top w:w="120" w:type="dxa"/>
+              <w:bottom w:w="120" w:type="dxa"/>
+              <w:left w:w="200" w:type="dxa"/>
+              <w:right w:w="150" w:type="dxa"/>
+            </w:tcMar>
+            <w:tcBorders>
+              <w:left w:val="single" w:sz="24" w:space="0" w:color="2E75B6"/>
+              <w:top w:val="none"/>
+              <w:bottom w:val="none"/>
+              <w:right w:val="none"/>
+            </w:tcBorders>
+          </w:tcPr>
+          <w:p>
+            <w:pPr>
+              <w:spacing w:before="40" w:after="40" w:line="276" w:lineRule="auto"/>
+            </w:pPr>
+            <w:r>
+              <w:rPr>
+                <w:rFonts w:ascii="Calibri" w:hAnsi="Calibri"/>
+                <w:i/>
+                <w:color w:val="1F3864"/>
+                <w:sz w:val="20"/>
+              </w:rPr>
+            </w:r>
+          </w:p>
+        </w:tc>
+      </w:tr>
+    </w:tbl>
+    <w:p>
+      <w:pPr>
+        <w:spacing w:after="80"/>
+      </w:pPr>
+    </w:p>
+    <w:tbl>
+      <w:tblPr>
+        <w:tblW w:type="auto" w:w="0"/>
+        <w:jc w:val="center"/>
+        <w:tblLayout w:type="fixed"/>
+        <w:tblLook w:firstColumn="1" w:firstRow="1" w:lastColumn="0" w:lastRow="0" w:noHBand="0" w:noVBand="1" w:val="04A0"/>
+      </w:tblPr>
+      <w:tblGrid>
+        <w:gridCol w:w="9029"/>
+      </w:tblGrid>
+      <w:tr>
+        <w:tc>
+          <w:tcPr>
+            <w:tcW w:type="dxa" w:w="9360"/>
+            <w:shd w:fill="EEF4FB"/>
+            <w:tcMar>
+              <w:top w:w="120" w:type="dxa"/>
+              <w:bottom w:w="120" w:type="dxa"/>
+              <w:left w:w="200" w:type="dxa"/>
+              <w:right w:w="150" w:type="dxa"/>
+            </w:tcMar>
+            <w:tcBorders>
+              <w:left w:val="single" w:sz="24" w:space="0" w:color="2E75B6"/>
+              <w:top w:val="none"/>
+              <w:bottom w:val="none"/>
+              <w:right w:val="none"/>
+            </w:tcBorders>
+          </w:tcPr>
+          <w:p>
+            <w:pPr>
+              <w:spacing w:before="40" w:after="40" w:line="276" w:lineRule="auto"/>
+            </w:pPr>
+            <w:r>
+              <w:rPr>
+                <w:rFonts w:ascii="Calibri" w:hAnsi="Calibri"/>
+                <w:i/>
+                <w:color w:val="1F3864"/>
+                <w:sz w:val="20"/>
+              </w:rPr>
+              <w:t>**Kepatuhan Adopsi BK Kompetensi Utama IS2020.** `BK-IS20` dan `BK-IS21` ditetapkan untuk memenuhi INSTRUKSI Panduan OBE APTIKOM SI v2.0 yang mewajibkan Program Studi **mengadopsi 11 BK kompetensi utama**, yaitu `BK09 Ethics, use and implications for society` (referensi IS2020) dan `BK10 Internship` (referensi **IABEE**). Kedua BK ini sebelumnya belum memiliki entri tersendiri meskipun mata kuliah pembinanya telah tersedia (`FST-206` dan `FST-612`).</w:t>
+            </w:r>
+          </w:p>
+        </w:tc>
+      </w:tr>
+    </w:tbl>
+    <w:p>
+      <w:pPr>
+        <w:spacing w:after="80"/>
+      </w:pPr>
+    </w:p>
+    <w:tbl>
+      <w:tblPr>
+        <w:tblW w:type="auto" w:w="0"/>
+        <w:jc w:val="center"/>
+        <w:tblLayout w:type="fixed"/>
+        <w:tblLook w:firstColumn="1" w:firstRow="1" w:lastColumn="0" w:lastRow="0" w:noHBand="0" w:noVBand="1" w:val="04A0"/>
+      </w:tblPr>
+      <w:tblGrid>
+        <w:gridCol w:w="9029"/>
+      </w:tblGrid>
+      <w:tr>
+        <w:tc>
+          <w:tcPr>
+            <w:tcW w:type="dxa" w:w="9360"/>
+            <w:shd w:fill="EEF4FB"/>
+            <w:tcMar>
+              <w:top w:w="120" w:type="dxa"/>
+              <w:bottom w:w="120" w:type="dxa"/>
+              <w:left w:w="200" w:type="dxa"/>
+              <w:right w:w="150" w:type="dxa"/>
+            </w:tcMar>
+            <w:tcBorders>
+              <w:left w:val="single" w:sz="24" w:space="0" w:color="2E75B6"/>
+              <w:top w:val="none"/>
+              <w:bottom w:val="none"/>
+              <w:right w:val="none"/>
+            </w:tcBorders>
+          </w:tcPr>
+          <w:p>
+            <w:pPr>
+              <w:spacing w:before="40" w:after="40" w:line="276" w:lineRule="auto"/>
+            </w:pPr>
+            <w:r>
+              <w:rPr>
+                <w:rFonts w:ascii="Calibri" w:hAnsi="Calibri"/>
+                <w:i/>
+                <w:color w:val="1F3864"/>
+                <w:sz w:val="20"/>
+              </w:rPr>
+              <w:t>`BK-IS20` sekaligus menjadi Bahan Kajian pertama yang membina **CPL Sikap (`S1`)** secara langsung, dan `BK-IS21` menjadi wadah formal capaian Keterampilan Umum melalui pengalaman kerja profesional.</w:t>
+            </w:r>
+          </w:p>
+        </w:tc>
+      </w:tr>
+    </w:tbl>
+    <w:p>
+      <w:pPr>
+        <w:spacing w:after="80"/>
       </w:pPr>
     </w:p>
     <w:p>
@@ -13406,7 +14290,7 @@
           <w:color w:val="1F3864"/>
           <w:sz w:val="26"/>
         </w:rPr>
-        <w:t>5. MATRIKS SILANG CPL ↔ 14 BAHAN KAJIAN UTAMA (BoK) IT2017 (APTIKOM)</w:t>
+        <w:t>5. MATRIKS SILANG CPL ↔ 15 BAHAN KAJIAN UTAMA (BoK) IT2017 (APTIKOM)</w:t>
       </w:r>
     </w:p>
     <w:p>
@@ -13419,7 +14303,7 @@
           <w:color w:val="262626"/>
           <w:sz w:val="21"/>
         </w:rPr>
-        <w:t>Berikut adalah matriks cross-tabulation pemenuhan 14 Bahan Kajian Utama Standar APTIKOM S1 Teknologi Informasi (IT2017/CC2020) terhadap 14 CPL SISTEKIN:</w:t>
+        <w:t>Berikut adalah matriks cross-tabulation pemenuhan 15 Bahan Kajian Utama Standar APTIKOM S1 Teknologi Informasi (IT2017/CC2020) terhadap 14 CPL SISTEKIN:</w:t>
       </w:r>
     </w:p>
     <w:tbl>
@@ -18704,10 +19588,518 @@
           </w:p>
         </w:tc>
       </w:tr>
+      <w:tr>
+        <w:trPr>
+          <w:cantSplit/>
+        </w:trPr>
+        <w:tc>
+          <w:tcPr>
+            <w:tcW w:type="dxa" w:w="564"/>
+            <w:vAlign w:val="center"/>
+            <w:shd w:fill="FFFFFF"/>
+            <w:tcMar>
+              <w:top w:w="80" w:type="dxa"/>
+              <w:bottom w:w="80" w:type="dxa"/>
+              <w:left w:w="100" w:type="dxa"/>
+              <w:right w:w="100" w:type="dxa"/>
+            </w:tcMar>
+          </w:tcPr>
+          <w:p>
+            <w:pPr>
+              <w:spacing w:before="20" w:after="20" w:line="252" w:lineRule="auto"/>
+              <w:jc w:val="left"/>
+            </w:pPr>
+            <w:r>
+              <w:rPr>
+                <w:rFonts w:ascii="Calibri" w:hAnsi="Calibri"/>
+                <w:b/>
+                <w:color w:val="262626"/>
+                <w:sz w:val="19"/>
+              </w:rPr>
+              <w:t>BK-IT15</w:t>
+            </w:r>
+          </w:p>
+        </w:tc>
+        <w:tc>
+          <w:tcPr>
+            <w:tcW w:type="dxa" w:w="564"/>
+            <w:vAlign w:val="center"/>
+            <w:shd w:fill="FFFFFF"/>
+            <w:tcMar>
+              <w:top w:w="80" w:type="dxa"/>
+              <w:bottom w:w="80" w:type="dxa"/>
+              <w:left w:w="100" w:type="dxa"/>
+              <w:right w:w="100" w:type="dxa"/>
+            </w:tcMar>
+          </w:tcPr>
+          <w:p>
+            <w:pPr>
+              <w:spacing w:before="20" w:after="20" w:line="252" w:lineRule="auto"/>
+              <w:jc w:val="left"/>
+            </w:pPr>
+            <w:r>
+              <w:rPr>
+                <w:rFonts w:ascii="Calibri" w:hAnsi="Calibri"/>
+                <w:i/>
+                <w:color w:val="262626"/>
+                <w:sz w:val="19"/>
+              </w:rPr>
+              <w:t>Global Professional Practice</w:t>
+            </w:r>
+          </w:p>
+        </w:tc>
+        <w:tc>
+          <w:tcPr>
+            <w:tcW w:type="dxa" w:w="564"/>
+            <w:vAlign w:val="center"/>
+            <w:shd w:fill="FFFFFF"/>
+            <w:tcMar>
+              <w:top w:w="80" w:type="dxa"/>
+              <w:bottom w:w="80" w:type="dxa"/>
+              <w:left w:w="100" w:type="dxa"/>
+              <w:right w:w="100" w:type="dxa"/>
+            </w:tcMar>
+          </w:tcPr>
+          <w:p>
+            <w:pPr>
+              <w:spacing w:before="20" w:after="20" w:line="252" w:lineRule="auto"/>
+              <w:jc w:val="left"/>
+            </w:pPr>
+            <w:r>
+              <w:rPr>
+                <w:rFonts w:ascii="Calibri" w:hAnsi="Calibri"/>
+                <w:color w:val="262626"/>
+                <w:sz w:val="19"/>
+              </w:rPr>
+              <w:t>✅</w:t>
+            </w:r>
+          </w:p>
+        </w:tc>
+        <w:tc>
+          <w:tcPr>
+            <w:tcW w:type="dxa" w:w="564"/>
+            <w:vAlign w:val="center"/>
+            <w:shd w:fill="FFFFFF"/>
+            <w:tcMar>
+              <w:top w:w="80" w:type="dxa"/>
+              <w:bottom w:w="80" w:type="dxa"/>
+              <w:left w:w="100" w:type="dxa"/>
+              <w:right w:w="100" w:type="dxa"/>
+            </w:tcMar>
+          </w:tcPr>
+          <w:p>
+            <w:pPr>
+              <w:spacing w:before="20" w:after="20" w:line="252" w:lineRule="auto"/>
+              <w:jc w:val="left"/>
+            </w:pPr>
+            <w:r>
+              <w:rPr>
+                <w:rFonts w:ascii="Calibri" w:hAnsi="Calibri"/>
+                <w:color w:val="262626"/>
+                <w:sz w:val="19"/>
+              </w:rPr>
+              <w:t>✅</w:t>
+            </w:r>
+          </w:p>
+        </w:tc>
+        <w:tc>
+          <w:tcPr>
+            <w:tcW w:type="dxa" w:w="564"/>
+            <w:vAlign w:val="center"/>
+            <w:shd w:fill="FFFFFF"/>
+            <w:tcMar>
+              <w:top w:w="80" w:type="dxa"/>
+              <w:bottom w:w="80" w:type="dxa"/>
+              <w:left w:w="100" w:type="dxa"/>
+              <w:right w:w="100" w:type="dxa"/>
+            </w:tcMar>
+          </w:tcPr>
+          <w:p>
+            <w:pPr>
+              <w:spacing w:before="20" w:after="20" w:line="252" w:lineRule="auto"/>
+              <w:jc w:val="left"/>
+            </w:pPr>
+            <w:r>
+              <w:rPr>
+                <w:rFonts w:ascii="Calibri" w:hAnsi="Calibri"/>
+                <w:color w:val="262626"/>
+                <w:sz w:val="19"/>
+              </w:rPr>
+              <w:t>✅</w:t>
+            </w:r>
+          </w:p>
+        </w:tc>
+        <w:tc>
+          <w:tcPr>
+            <w:tcW w:type="dxa" w:w="564"/>
+            <w:vAlign w:val="center"/>
+            <w:shd w:fill="FFFFFF"/>
+            <w:tcMar>
+              <w:top w:w="80" w:type="dxa"/>
+              <w:bottom w:w="80" w:type="dxa"/>
+              <w:left w:w="100" w:type="dxa"/>
+              <w:right w:w="100" w:type="dxa"/>
+            </w:tcMar>
+          </w:tcPr>
+          <w:p>
+            <w:pPr>
+              <w:spacing w:before="20" w:after="20" w:line="252" w:lineRule="auto"/>
+              <w:jc w:val="left"/>
+            </w:pPr>
+            <w:r>
+              <w:rPr>
+                <w:rFonts w:ascii="Calibri" w:hAnsi="Calibri"/>
+                <w:color w:val="262626"/>
+                <w:sz w:val="19"/>
+              </w:rPr>
+              <w:t>✅</w:t>
+            </w:r>
+          </w:p>
+        </w:tc>
+        <w:tc>
+          <w:tcPr>
+            <w:tcW w:type="dxa" w:w="564"/>
+            <w:vAlign w:val="center"/>
+            <w:shd w:fill="FFFFFF"/>
+            <w:tcMar>
+              <w:top w:w="80" w:type="dxa"/>
+              <w:bottom w:w="80" w:type="dxa"/>
+              <w:left w:w="100" w:type="dxa"/>
+              <w:right w:w="100" w:type="dxa"/>
+            </w:tcMar>
+          </w:tcPr>
+          <w:p>
+            <w:pPr>
+              <w:spacing w:before="20" w:after="20" w:line="252" w:lineRule="auto"/>
+              <w:jc w:val="left"/>
+            </w:pPr>
+          </w:p>
+        </w:tc>
+        <w:tc>
+          <w:tcPr>
+            <w:tcW w:type="dxa" w:w="564"/>
+            <w:vAlign w:val="center"/>
+            <w:shd w:fill="FFFFFF"/>
+            <w:tcMar>
+              <w:top w:w="80" w:type="dxa"/>
+              <w:bottom w:w="80" w:type="dxa"/>
+              <w:left w:w="100" w:type="dxa"/>
+              <w:right w:w="100" w:type="dxa"/>
+            </w:tcMar>
+          </w:tcPr>
+          <w:p>
+            <w:pPr>
+              <w:spacing w:before="20" w:after="20" w:line="252" w:lineRule="auto"/>
+              <w:jc w:val="left"/>
+            </w:pPr>
+          </w:p>
+        </w:tc>
+        <w:tc>
+          <w:tcPr>
+            <w:tcW w:type="dxa" w:w="564"/>
+            <w:vAlign w:val="center"/>
+            <w:shd w:fill="FFFFFF"/>
+            <w:tcMar>
+              <w:top w:w="80" w:type="dxa"/>
+              <w:bottom w:w="80" w:type="dxa"/>
+              <w:left w:w="100" w:type="dxa"/>
+              <w:right w:w="100" w:type="dxa"/>
+            </w:tcMar>
+          </w:tcPr>
+          <w:p>
+            <w:pPr>
+              <w:spacing w:before="20" w:after="20" w:line="252" w:lineRule="auto"/>
+              <w:jc w:val="left"/>
+            </w:pPr>
+          </w:p>
+        </w:tc>
+        <w:tc>
+          <w:tcPr>
+            <w:tcW w:type="dxa" w:w="564"/>
+            <w:vAlign w:val="center"/>
+            <w:shd w:fill="FFFFFF"/>
+            <w:tcMar>
+              <w:top w:w="80" w:type="dxa"/>
+              <w:bottom w:w="80" w:type="dxa"/>
+              <w:left w:w="100" w:type="dxa"/>
+              <w:right w:w="100" w:type="dxa"/>
+            </w:tcMar>
+          </w:tcPr>
+          <w:p>
+            <w:pPr>
+              <w:spacing w:before="20" w:after="20" w:line="252" w:lineRule="auto"/>
+              <w:jc w:val="left"/>
+            </w:pPr>
+          </w:p>
+        </w:tc>
+        <w:tc>
+          <w:tcPr>
+            <w:tcW w:type="dxa" w:w="564"/>
+            <w:vAlign w:val="center"/>
+            <w:shd w:fill="FFFFFF"/>
+            <w:tcMar>
+              <w:top w:w="80" w:type="dxa"/>
+              <w:bottom w:w="80" w:type="dxa"/>
+              <w:left w:w="100" w:type="dxa"/>
+              <w:right w:w="100" w:type="dxa"/>
+            </w:tcMar>
+          </w:tcPr>
+          <w:p>
+            <w:pPr>
+              <w:spacing w:before="20" w:after="20" w:line="252" w:lineRule="auto"/>
+              <w:jc w:val="left"/>
+            </w:pPr>
+          </w:p>
+        </w:tc>
+        <w:tc>
+          <w:tcPr>
+            <w:tcW w:type="dxa" w:w="564"/>
+            <w:vAlign w:val="center"/>
+            <w:shd w:fill="FFFFFF"/>
+            <w:tcMar>
+              <w:top w:w="80" w:type="dxa"/>
+              <w:bottom w:w="80" w:type="dxa"/>
+              <w:left w:w="100" w:type="dxa"/>
+              <w:right w:w="100" w:type="dxa"/>
+            </w:tcMar>
+          </w:tcPr>
+          <w:p>
+            <w:pPr>
+              <w:spacing w:before="20" w:after="20" w:line="252" w:lineRule="auto"/>
+              <w:jc w:val="left"/>
+            </w:pPr>
+          </w:p>
+        </w:tc>
+        <w:tc>
+          <w:tcPr>
+            <w:tcW w:type="dxa" w:w="564"/>
+            <w:vAlign w:val="center"/>
+            <w:shd w:fill="FFFFFF"/>
+            <w:tcMar>
+              <w:top w:w="80" w:type="dxa"/>
+              <w:bottom w:w="80" w:type="dxa"/>
+              <w:left w:w="100" w:type="dxa"/>
+              <w:right w:w="100" w:type="dxa"/>
+            </w:tcMar>
+          </w:tcPr>
+          <w:p>
+            <w:pPr>
+              <w:spacing w:before="20" w:after="20" w:line="252" w:lineRule="auto"/>
+              <w:jc w:val="left"/>
+            </w:pPr>
+          </w:p>
+        </w:tc>
+        <w:tc>
+          <w:tcPr>
+            <w:tcW w:type="dxa" w:w="564"/>
+            <w:vAlign w:val="center"/>
+            <w:shd w:fill="FFFFFF"/>
+            <w:tcMar>
+              <w:top w:w="80" w:type="dxa"/>
+              <w:bottom w:w="80" w:type="dxa"/>
+              <w:left w:w="100" w:type="dxa"/>
+              <w:right w:w="100" w:type="dxa"/>
+            </w:tcMar>
+          </w:tcPr>
+          <w:p>
+            <w:pPr>
+              <w:spacing w:before="20" w:after="20" w:line="252" w:lineRule="auto"/>
+              <w:jc w:val="left"/>
+            </w:pPr>
+          </w:p>
+        </w:tc>
+        <w:tc>
+          <w:tcPr>
+            <w:tcW w:type="dxa" w:w="564"/>
+            <w:vAlign w:val="center"/>
+            <w:shd w:fill="FFFFFF"/>
+            <w:tcMar>
+              <w:top w:w="80" w:type="dxa"/>
+              <w:bottom w:w="80" w:type="dxa"/>
+              <w:left w:w="100" w:type="dxa"/>
+              <w:right w:w="100" w:type="dxa"/>
+            </w:tcMar>
+          </w:tcPr>
+          <w:p>
+            <w:pPr>
+              <w:spacing w:before="20" w:after="20" w:line="252" w:lineRule="auto"/>
+              <w:jc w:val="left"/>
+            </w:pPr>
+          </w:p>
+        </w:tc>
+        <w:tc>
+          <w:tcPr>
+            <w:tcW w:type="dxa" w:w="564"/>
+            <w:vAlign w:val="center"/>
+            <w:shd w:fill="FFFFFF"/>
+            <w:tcMar>
+              <w:top w:w="80" w:type="dxa"/>
+              <w:bottom w:w="80" w:type="dxa"/>
+              <w:left w:w="100" w:type="dxa"/>
+              <w:right w:w="100" w:type="dxa"/>
+            </w:tcMar>
+          </w:tcPr>
+          <w:p>
+            <w:pPr>
+              <w:spacing w:before="20" w:after="20" w:line="252" w:lineRule="auto"/>
+              <w:jc w:val="left"/>
+            </w:pPr>
+          </w:p>
+        </w:tc>
+      </w:tr>
     </w:tbl>
     <w:p>
       <w:pPr>
         <w:spacing w:after="120"/>
+      </w:pPr>
+    </w:p>
+    <w:tbl>
+      <w:tblPr>
+        <w:tblW w:type="auto" w:w="0"/>
+        <w:jc w:val="center"/>
+        <w:tblLayout w:type="fixed"/>
+        <w:tblLook w:firstColumn="1" w:firstRow="1" w:lastColumn="0" w:lastRow="0" w:noHBand="0" w:noVBand="1" w:val="04A0"/>
+      </w:tblPr>
+      <w:tblGrid>
+        <w:gridCol w:w="9029"/>
+      </w:tblGrid>
+      <w:tr>
+        <w:tc>
+          <w:tcPr>
+            <w:tcW w:type="dxa" w:w="9360"/>
+            <w:shd w:fill="EEF4FB"/>
+            <w:tcMar>
+              <w:top w:w="120" w:type="dxa"/>
+              <w:bottom w:w="120" w:type="dxa"/>
+              <w:left w:w="200" w:type="dxa"/>
+              <w:right w:w="150" w:type="dxa"/>
+            </w:tcMar>
+            <w:tcBorders>
+              <w:left w:val="single" w:sz="24" w:space="0" w:color="2E75B6"/>
+              <w:top w:val="none"/>
+              <w:bottom w:val="none"/>
+              <w:right w:val="none"/>
+            </w:tcBorders>
+          </w:tcPr>
+          <w:p>
+            <w:pPr>
+              <w:spacing w:before="40" w:after="40" w:line="276" w:lineRule="auto"/>
+            </w:pPr>
+            <w:r>
+              <w:rPr>
+                <w:rFonts w:ascii="Calibri" w:hAnsi="Calibri"/>
+                <w:i/>
+                <w:color w:val="1F3864"/>
+                <w:sz w:val="20"/>
+              </w:rPr>
+            </w:r>
+          </w:p>
+        </w:tc>
+      </w:tr>
+    </w:tbl>
+    <w:p>
+      <w:pPr>
+        <w:spacing w:after="80"/>
+      </w:pPr>
+    </w:p>
+    <w:tbl>
+      <w:tblPr>
+        <w:tblW w:type="auto" w:w="0"/>
+        <w:jc w:val="center"/>
+        <w:tblLayout w:type="fixed"/>
+        <w:tblLook w:firstColumn="1" w:firstRow="1" w:lastColumn="0" w:lastRow="0" w:noHBand="0" w:noVBand="1" w:val="04A0"/>
+      </w:tblPr>
+      <w:tblGrid>
+        <w:gridCol w:w="9029"/>
+      </w:tblGrid>
+      <w:tr>
+        <w:tc>
+          <w:tcPr>
+            <w:tcW w:type="dxa" w:w="9360"/>
+            <w:shd w:fill="EEF4FB"/>
+            <w:tcMar>
+              <w:top w:w="120" w:type="dxa"/>
+              <w:bottom w:w="120" w:type="dxa"/>
+              <w:left w:w="200" w:type="dxa"/>
+              <w:right w:w="150" w:type="dxa"/>
+            </w:tcMar>
+            <w:tcBorders>
+              <w:left w:val="single" w:sz="24" w:space="0" w:color="2E75B6"/>
+              <w:top w:val="none"/>
+              <w:bottom w:val="none"/>
+              <w:right w:val="none"/>
+            </w:tcBorders>
+          </w:tcPr>
+          <w:p>
+            <w:pPr>
+              <w:spacing w:before="40" w:after="40" w:line="276" w:lineRule="auto"/>
+            </w:pPr>
+            <w:r>
+              <w:rPr>
+                <w:rFonts w:ascii="Calibri" w:hAnsi="Calibri"/>
+                <w:i/>
+                <w:color w:val="1F3864"/>
+                <w:sz w:val="20"/>
+              </w:rPr>
+              <w:t>**Kepatuhan Adopsi BK Penciri Utama IT2017.** `BK-IT15` ditetapkan untuk memenuhi ketentuan Panduan Kurikulum OBE Prodi S1 Teknologi Informasi 2023 yang mewajibkan Program Studi **mengadopsi 14 BK Penciri Utama**, yaitu `BK08 Praktek Profesional Global` (referensi IT-2017) yang sebelumnya belum memiliki entri padanan.</w:t>
+            </w:r>
+          </w:p>
+        </w:tc>
+      </w:tr>
+    </w:tbl>
+    <w:p>
+      <w:pPr>
+        <w:spacing w:after="80"/>
+      </w:pPr>
+    </w:p>
+    <w:tbl>
+      <w:tblPr>
+        <w:tblW w:type="auto" w:w="0"/>
+        <w:jc w:val="center"/>
+        <w:tblLayout w:type="fixed"/>
+        <w:tblLook w:firstColumn="1" w:firstRow="1" w:lastColumn="0" w:lastRow="0" w:noHBand="0" w:noVBand="1" w:val="04A0"/>
+      </w:tblPr>
+      <w:tblGrid>
+        <w:gridCol w:w="9029"/>
+      </w:tblGrid>
+      <w:tr>
+        <w:tc>
+          <w:tcPr>
+            <w:tcW w:type="dxa" w:w="9360"/>
+            <w:shd w:fill="EEF4FB"/>
+            <w:tcMar>
+              <w:top w:w="120" w:type="dxa"/>
+              <w:bottom w:w="120" w:type="dxa"/>
+              <w:left w:w="200" w:type="dxa"/>
+              <w:right w:w="150" w:type="dxa"/>
+            </w:tcMar>
+            <w:tcBorders>
+              <w:left w:val="single" w:sz="24" w:space="0" w:color="2E75B6"/>
+              <w:top w:val="none"/>
+              <w:bottom w:val="none"/>
+              <w:right w:val="none"/>
+            </w:tcBorders>
+          </w:tcPr>
+          <w:p>
+            <w:pPr>
+              <w:spacing w:before="40" w:after="40" w:line="276" w:lineRule="auto"/>
+            </w:pPr>
+            <w:r>
+              <w:rPr>
+                <w:rFonts w:ascii="Calibri" w:hAnsi="Calibri"/>
+                <w:i/>
+                <w:color w:val="1F3864"/>
+                <w:sz w:val="20"/>
+              </w:rPr>
+              <w:t>Bahan Kajian ini membina kesiapan lulusan bekerja pada lingkungan profesional lintas negara dan lintas budaya, dan dibina oleh `FST-205` Basic English for IT (komunikasi teknis berbahasa Inggris), `FST-206` Etika Profesi &amp; Hukum Digital, `MKU-507` Kuliah Pengabdian kepada Masyarakat, serta `FST-612` Praktik Kerja Lapangan.</w:t>
+            </w:r>
+          </w:p>
+        </w:tc>
+      </w:tr>
+    </w:tbl>
+    <w:p>
+      <w:pPr>
+        <w:spacing w:after="80"/>
       </w:pPr>
     </w:p>
     <w:p>
@@ -22154,7 +23546,7 @@
           <w:color w:val="262626"/>
           <w:sz w:val="21"/>
         </w:rPr>
-        <w:t xml:space="preserve"> Setiap CPL memiliki silsilah rujukan asli yang eksplisit, indikator kinerja terukur, pemetaan taksonomi Bloom, serta matriks silang lengkap terhadap 19 BoK IS, 14 BoK IT, 4 Profil Lulusan, dan 3 PEO.</w:t>
+        <w:t xml:space="preserve"> Setiap CPL memiliki silsilah rujukan asli yang eksplisit, indikator kinerja terukur, pemetaan taksonomi Bloom, serta matriks silang lengkap terhadap 21 BoK IS, 15 BoK IT, 4 Profil Lulusan, dan 3 PEO.</w:t>
       </w:r>
     </w:p>
     <w:p>

</xml_diff>